<commit_message>
feat: agregar campo destino
</commit_message>
<xml_diff>
--- a/pesaje/analytica/Report/PrintActaEntregaTickets.docx
+++ b/pesaje/analytica/Report/PrintActaEntregaTickets.docx
@@ -3191,7 +3191,7 @@
                 <w:sz w:val="16"/>
                 <w:szCs w:val="16"/>
               </w:rPr>
-              <w:instrText xml:space="preserve"> MERGEFIELD  sucursal_empresa  \* MERGEFORMAT </w:instrText>
+              <w:instrText xml:space="preserve"> MERGEFIELD  destino  \* MERGEFORMAT </w:instrText>
             </w:r>
             <w:r>
               <w:rPr>
@@ -3205,11 +3205,12 @@
             <w:r>
               <w:rPr>
                 <w:rFonts w:ascii="Arial" w:hAnsi="Arial" w:cs="Arial"/>
-                <w:color w:val="000000" w:themeColor="text1"/>
-                <w:sz w:val="16"/>
-                <w:szCs w:val="16"/>
-              </w:rPr>
-              <w:t>«sucursal_empresa»</w:t>
+                <w:noProof/>
+                <w:color w:val="000000" w:themeColor="text1"/>
+                <w:sz w:val="16"/>
+                <w:szCs w:val="16"/>
+              </w:rPr>
+              <w:t>«destino»</w:t>
             </w:r>
             <w:r>
               <w:rPr>

</xml_diff>

<commit_message>
feat: actualizar plantillas de actas tickets
</commit_message>
<xml_diff>
--- a/pesaje/analytica/Report/PrintActaEntregaTickets.docx
+++ b/pesaje/analytica/Report/PrintActaEntregaTickets.docx
@@ -709,7 +709,6 @@
                 <w:szCs w:val="16"/>
               </w:rPr>
             </w:pPr>
-            <w:proofErr w:type="gramStart"/>
             <w:r>
               <w:rPr>
                 <w:rFonts w:ascii="Arial" w:hAnsi="Arial" w:cs="Arial"/>
@@ -720,35 +719,8 @@
                 <w:szCs w:val="16"/>
                 <w:lang w:val="es-PE"/>
               </w:rPr>
-              <w:t>Ticket</w:t>
-            </w:r>
-            <w:proofErr w:type="gramEnd"/>
-            <w:r>
-              <w:rPr>
-                <w:rFonts w:ascii="Arial" w:hAnsi="Arial" w:cs="Arial"/>
-                <w:b/>
-                <w:bCs/>
-                <w:color w:val="000000" w:themeColor="text1"/>
-                <w:sz w:val="16"/>
-                <w:szCs w:val="16"/>
-                <w:lang w:val="es-PE"/>
-              </w:rPr>
-              <w:t xml:space="preserve"> de Pesaje </w:t>
-            </w:r>
-            <w:proofErr w:type="spellStart"/>
-            <w:r>
-              <w:rPr>
-                <w:rFonts w:ascii="Arial" w:hAnsi="Arial" w:cs="Arial"/>
-                <w:b/>
-                <w:bCs/>
-                <w:color w:val="000000" w:themeColor="text1"/>
-                <w:sz w:val="16"/>
-                <w:szCs w:val="16"/>
-                <w:lang w:val="es-PE"/>
-              </w:rPr>
-              <w:t>N°</w:t>
-            </w:r>
-            <w:proofErr w:type="spellEnd"/>
+              <w:t>Ticket de Pesaje N°</w:t>
+            </w:r>
           </w:p>
         </w:tc>
         <w:tc>
@@ -2081,7 +2053,6 @@
                 <w:szCs w:val="16"/>
               </w:rPr>
             </w:pPr>
-            <w:proofErr w:type="spellStart"/>
             <w:r>
               <w:rPr>
                 <w:rFonts w:ascii="Arial" w:hAnsi="Arial" w:cs="Arial"/>
@@ -2092,20 +2063,7 @@
                 <w:szCs w:val="16"/>
                 <w:lang w:val="es-PE"/>
               </w:rPr>
-              <w:t>N°</w:t>
-            </w:r>
-            <w:proofErr w:type="spellEnd"/>
-            <w:r>
-              <w:rPr>
-                <w:rFonts w:ascii="Arial" w:hAnsi="Arial" w:cs="Arial"/>
-                <w:b/>
-                <w:bCs/>
-                <w:color w:val="000000" w:themeColor="text1"/>
-                <w:sz w:val="16"/>
-                <w:szCs w:val="16"/>
-                <w:lang w:val="es-PE"/>
-              </w:rPr>
-              <w:t xml:space="preserve"> Doc / Guia R.</w:t>
+              <w:t>N° Doc / Guia R.</w:t>
             </w:r>
           </w:p>
         </w:tc>
@@ -2799,7 +2757,7 @@
                 <w:sz w:val="16"/>
                 <w:szCs w:val="16"/>
               </w:rPr>
-              <w:instrText xml:space="preserve"> MERGEFIELD  nom_tipo_mineral  \* MERGEFORMAT </w:instrText>
+              <w:instrText xml:space="preserve"> MERGEFIELD  producto  \* MERGEFORMAT </w:instrText>
             </w:r>
             <w:r>
               <w:rPr>
@@ -2813,11 +2771,12 @@
             <w:r>
               <w:rPr>
                 <w:rFonts w:ascii="Arial" w:hAnsi="Arial" w:cs="Arial"/>
-                <w:color w:val="000000" w:themeColor="text1"/>
-                <w:sz w:val="16"/>
-                <w:szCs w:val="16"/>
-              </w:rPr>
-              <w:t>«nom_tipo_mineral»</w:t>
+                <w:noProof/>
+                <w:color w:val="000000" w:themeColor="text1"/>
+                <w:sz w:val="16"/>
+                <w:szCs w:val="16"/>
+              </w:rPr>
+              <w:t>«producto»</w:t>
             </w:r>
             <w:r>
               <w:rPr>

</xml_diff>